<commit_message>
fix(p4/p6): standardize APA7 volume italic format
P4 Vi (p4_singapore_vi.md): 30 references used *Journal*, *Volume*(Issue)
— two separate italic spans. Fixed to *Journal, Volume*(Issue) matching
the canonical form in thesis/04_references_apa7.md and all English MSs.
Rebuilt dist/manuscripts/vi/p4_singapore_vi.docx.

P6 En (p6_meta_manuscript_en.md): 35 references used *Journal*, Volume(Issue)
— volume outside italic entirely. Same fix applied. Rebuilt dist and IBR
blinded docx.

P3/P5/P7/P8 English manuscripts and thesis master ref list were already
correct (verified: 0 bad, 44/24/24/25/165 good respectively).

https://claude.ai/code/session_01GMFmEtt6FYiJ4MKzBNCLqb
</commit_message>
<xml_diff>
--- a/dist/manuscripts/vi/p4_singapore_vi.docx
+++ b/dist/manuscripts/vi/p4_singapore_vi.docx
@@ -5308,20 +5308,7 @@
           <w:iCs/>
           <w:i/>
         </w:rPr>
-        <w:t xml:space="preserve">Journal of Applied Psychology</w:t>
-      </w:r>
-      <w:r>
-        <w:t xml:space="preserve">,</w:t>
-      </w:r>
-      <w:r>
-        <w:t xml:space="preserve"> </w:t>
-      </w:r>
-      <w:r>
-        <w:rPr>
-          <w:iCs/>
-          <w:i/>
-        </w:rPr>
-        <w:t xml:space="preserve">90</w:t>
+        <w:t xml:space="preserve">Journal of Applied Psychology, 90</w:t>
       </w:r>
       <w:r>
         <w:t xml:space="preserve">(1), 94–107.</w:t>
@@ -5374,20 +5361,7 @@
           <w:iCs/>
           <w:i/>
         </w:rPr>
-        <w:t xml:space="preserve">The Leadership Quarterly</w:t>
-      </w:r>
-      <w:r>
-        <w:t xml:space="preserve">,</w:t>
-      </w:r>
-      <w:r>
-        <w:t xml:space="preserve"> </w:t>
-      </w:r>
-      <w:r>
-        <w:rPr>
-          <w:iCs/>
-          <w:i/>
-        </w:rPr>
-        <w:t xml:space="preserve">21</w:t>
+        <w:t xml:space="preserve">The Leadership Quarterly, 21</w:t>
       </w:r>
       <w:r>
         <w:t xml:space="preserve">(6), 1086–1120.</w:t>
@@ -5419,20 +5393,7 @@
           <w:iCs/>
           <w:i/>
         </w:rPr>
-        <w:t xml:space="preserve">The European Journal of Development Research</w:t>
-      </w:r>
-      <w:r>
-        <w:t xml:space="preserve">,</w:t>
-      </w:r>
-      <w:r>
-        <w:t xml:space="preserve"> </w:t>
-      </w:r>
-      <w:r>
-        <w:rPr>
-          <w:iCs/>
-          <w:i/>
-        </w:rPr>
-        <w:t xml:space="preserve">33</w:t>
+        <w:t xml:space="preserve">The European Journal of Development Research, 33</w:t>
       </w:r>
       <w:r>
         <w:t xml:space="preserve">(2), 304–329.</w:t>
@@ -5464,20 +5425,7 @@
           <w:iCs/>
           <w:i/>
         </w:rPr>
-        <w:t xml:space="preserve">Journal of International Business Studies</w:t>
-      </w:r>
-      <w:r>
-        <w:t xml:space="preserve">,</w:t>
-      </w:r>
-      <w:r>
-        <w:t xml:space="preserve"> </w:t>
-      </w:r>
-      <w:r>
-        <w:rPr>
-          <w:iCs/>
-          <w:i/>
-        </w:rPr>
-        <w:t xml:space="preserve">50</w:t>
+        <w:t xml:space="preserve">Journal of International Business Studies, 50</w:t>
       </w:r>
       <w:r>
         <w:t xml:space="preserve">(8), 1372–1387.</w:t>
@@ -5509,20 +5457,7 @@
           <w:iCs/>
           <w:i/>
         </w:rPr>
-        <w:t xml:space="preserve">Journal of Management</w:t>
-      </w:r>
-      <w:r>
-        <w:t xml:space="preserve">,</w:t>
-      </w:r>
-      <w:r>
-        <w:t xml:space="preserve"> </w:t>
-      </w:r>
-      <w:r>
-        <w:rPr>
-          <w:iCs/>
-          <w:i/>
-        </w:rPr>
-        <w:t xml:space="preserve">17</w:t>
+        <w:t xml:space="preserve">Journal of Management, 17</w:t>
       </w:r>
       <w:r>
         <w:t xml:space="preserve">(1), 99–120.</w:t>
@@ -5554,20 +5489,7 @@
           <w:iCs/>
           <w:i/>
         </w:rPr>
-        <w:t xml:space="preserve">MIS Quarterly</w:t>
-      </w:r>
-      <w:r>
-        <w:t xml:space="preserve">,</w:t>
-      </w:r>
-      <w:r>
-        <w:t xml:space="preserve"> </w:t>
-      </w:r>
-      <w:r>
-        <w:rPr>
-          <w:iCs/>
-          <w:i/>
-        </w:rPr>
-        <w:t xml:space="preserve">37</w:t>
+        <w:t xml:space="preserve">MIS Quarterly, 37</w:t>
       </w:r>
       <w:r>
         <w:t xml:space="preserve">(2), 471–482.</w:t>
@@ -5599,20 +5521,7 @@
           <w:iCs/>
           <w:i/>
         </w:rPr>
-        <w:t xml:space="preserve">American Economic Journal: Macroeconomics</w:t>
-      </w:r>
-      <w:r>
-        <w:t xml:space="preserve">,</w:t>
-      </w:r>
-      <w:r>
-        <w:t xml:space="preserve"> </w:t>
-      </w:r>
-      <w:r>
-        <w:rPr>
-          <w:iCs/>
-          <w:i/>
-        </w:rPr>
-        <w:t xml:space="preserve">13</w:t>
+        <w:t xml:space="preserve">American Economic Journal: Macroeconomics, 13</w:t>
       </w:r>
       <w:r>
         <w:t xml:space="preserve">(1), 333–372.</w:t>
@@ -5668,20 +5577,7 @@
           <w:iCs/>
           <w:i/>
         </w:rPr>
-        <w:t xml:space="preserve">Administrative Science Quarterly</w:t>
-      </w:r>
-      <w:r>
-        <w:t xml:space="preserve">,</w:t>
-      </w:r>
-      <w:r>
-        <w:t xml:space="preserve"> </w:t>
-      </w:r>
-      <w:r>
-        <w:rPr>
-          <w:iCs/>
-          <w:i/>
-        </w:rPr>
-        <w:t xml:space="preserve">35</w:t>
+        <w:t xml:space="preserve">Administrative Science Quarterly, 35</w:t>
       </w:r>
       <w:r>
         <w:t xml:space="preserve">(1), 128–152.</w:t>
@@ -5713,20 +5609,7 @@
           <w:iCs/>
           <w:i/>
         </w:rPr>
-        <w:t xml:space="preserve">Journal of Business Research</w:t>
-      </w:r>
-      <w:r>
-        <w:t xml:space="preserve">,</w:t>
-      </w:r>
-      <w:r>
-        <w:t xml:space="preserve"> </w:t>
-      </w:r>
-      <w:r>
-        <w:rPr>
-          <w:iCs/>
-          <w:i/>
-        </w:rPr>
-        <w:t xml:space="preserve">61</w:t>
+        <w:t xml:space="preserve">Journal of Business Research, 61</w:t>
       </w:r>
       <w:r>
         <w:t xml:space="preserve">(12), 1250–1262.</w:t>
@@ -5758,20 +5641,7 @@
           <w:iCs/>
           <w:i/>
         </w:rPr>
-        <w:t xml:space="preserve">Management International Review</w:t>
-      </w:r>
-      <w:r>
-        <w:t xml:space="preserve">,</w:t>
-      </w:r>
-      <w:r>
-        <w:t xml:space="preserve"> </w:t>
-      </w:r>
-      <w:r>
-        <w:rPr>
-          <w:iCs/>
-          <w:i/>
-        </w:rPr>
-        <w:t xml:space="preserve">47</w:t>
+        <w:t xml:space="preserve">Management International Review, 47</w:t>
       </w:r>
       <w:r>
         <w:t xml:space="preserve">(3), 453–475.</w:t>
@@ -5803,20 +5673,7 @@
           <w:iCs/>
           <w:i/>
         </w:rPr>
-        <w:t xml:space="preserve">Journal of International Business Studies</w:t>
-      </w:r>
-      <w:r>
-        <w:t xml:space="preserve">,</w:t>
-      </w:r>
-      <w:r>
-        <w:t xml:space="preserve"> </w:t>
-      </w:r>
-      <w:r>
-        <w:rPr>
-          <w:iCs/>
-          <w:i/>
-        </w:rPr>
-        <w:t xml:space="preserve">34</w:t>
+        <w:t xml:space="preserve">Journal of International Business Studies, 34</w:t>
       </w:r>
       <w:r>
         <w:t xml:space="preserve">(1), 5–18.</w:t>
@@ -5848,20 +5705,7 @@
           <w:iCs/>
           <w:i/>
         </w:rPr>
-        <w:t xml:space="preserve">Strategic Management Journal</w:t>
-      </w:r>
-      <w:r>
-        <w:t xml:space="preserve">,</w:t>
-      </w:r>
-      <w:r>
-        <w:t xml:space="preserve"> </w:t>
-      </w:r>
-      <w:r>
-        <w:rPr>
-          <w:iCs/>
-          <w:i/>
-        </w:rPr>
-        <w:t xml:space="preserve">37</w:t>
+        <w:t xml:space="preserve">Strategic Management Journal, 37</w:t>
       </w:r>
       <w:r>
         <w:t xml:space="preserve">(7), 1177–1195.</w:t>
@@ -5893,20 +5737,7 @@
           <w:iCs/>
           <w:i/>
         </w:rPr>
-        <w:t xml:space="preserve">Academy of Management Review</w:t>
-      </w:r>
-      <w:r>
-        <w:t xml:space="preserve">,</w:t>
-      </w:r>
-      <w:r>
-        <w:t xml:space="preserve"> </w:t>
-      </w:r>
-      <w:r>
-        <w:rPr>
-          <w:iCs/>
-          <w:i/>
-        </w:rPr>
-        <w:t xml:space="preserve">9</w:t>
+        <w:t xml:space="preserve">Academy of Management Review, 9</w:t>
       </w:r>
       <w:r>
         <w:t xml:space="preserve">(2), 193–206.</w:t>
@@ -5938,20 +5769,7 @@
           <w:iCs/>
           <w:i/>
         </w:rPr>
-        <w:t xml:space="preserve">Academy of Management Journal</w:t>
-      </w:r>
-      <w:r>
-        <w:t xml:space="preserve">,</w:t>
-      </w:r>
-      <w:r>
-        <w:t xml:space="preserve"> </w:t>
-      </w:r>
-      <w:r>
-        <w:rPr>
-          <w:iCs/>
-          <w:i/>
-        </w:rPr>
-        <w:t xml:space="preserve">40</w:t>
+        <w:t xml:space="preserve">Academy of Management Journal, 40</w:t>
       </w:r>
       <w:r>
         <w:t xml:space="preserve">(4), 767–798.</w:t>
@@ -5983,20 +5801,7 @@
           <w:iCs/>
           <w:i/>
         </w:rPr>
-        <w:t xml:space="preserve">International Business Review</w:t>
-      </w:r>
-      <w:r>
-        <w:t xml:space="preserve">,</w:t>
-      </w:r>
-      <w:r>
-        <w:t xml:space="preserve"> </w:t>
-      </w:r>
-      <w:r>
-        <w:rPr>
-          <w:iCs/>
-          <w:i/>
-        </w:rPr>
-        <w:t xml:space="preserve">27</w:t>
+        <w:t xml:space="preserve">International Business Review, 27</w:t>
       </w:r>
       <w:r>
         <w:t xml:space="preserve">(1), 218–230.</w:t>
@@ -6028,20 +5833,7 @@
           <w:iCs/>
           <w:i/>
         </w:rPr>
-        <w:t xml:space="preserve">Advances in Methods and Practices in Psychological Science</w:t>
-      </w:r>
-      <w:r>
-        <w:t xml:space="preserve">,</w:t>
-      </w:r>
-      <w:r>
-        <w:t xml:space="preserve"> </w:t>
-      </w:r>
-      <w:r>
-        <w:rPr>
-          <w:iCs/>
-          <w:i/>
-        </w:rPr>
-        <w:t xml:space="preserve">1</w:t>
+        <w:t xml:space="preserve">Advances in Methods and Practices in Psychological Science, 1</w:t>
       </w:r>
       <w:r>
         <w:t xml:space="preserve">(2), 259–269.</w:t>
@@ -6073,20 +5865,7 @@
           <w:iCs/>
           <w:i/>
         </w:rPr>
-        <w:t xml:space="preserve">World Development</w:t>
-      </w:r>
-      <w:r>
-        <w:t xml:space="preserve">,</w:t>
-      </w:r>
-      <w:r>
-        <w:t xml:space="preserve"> </w:t>
-      </w:r>
-      <w:r>
-        <w:rPr>
-          <w:iCs/>
-          <w:i/>
-        </w:rPr>
-        <w:t xml:space="preserve">20</w:t>
+        <w:t xml:space="preserve">World Development, 20</w:t>
       </w:r>
       <w:r>
         <w:t xml:space="preserve">(2), 165–186.</w:t>
@@ -6118,20 +5897,7 @@
           <w:iCs/>
           <w:i/>
         </w:rPr>
-        <w:t xml:space="preserve">Oxford Bulletin of Economics and Statistics</w:t>
-      </w:r>
-      <w:r>
-        <w:t xml:space="preserve">,</w:t>
-      </w:r>
-      <w:r>
-        <w:t xml:space="preserve"> </w:t>
-      </w:r>
-      <w:r>
-        <w:rPr>
-          <w:iCs/>
-          <w:i/>
-        </w:rPr>
-        <w:t xml:space="preserve">72</w:t>
+        <w:t xml:space="preserve">Oxford Bulletin of Economics and Statistics, 72</w:t>
       </w:r>
       <w:r>
         <w:t xml:space="preserve">(1), 109–118.</w:t>
@@ -6163,20 +5929,7 @@
           <w:iCs/>
           <w:i/>
         </w:rPr>
-        <w:t xml:space="preserve">Academy of Management Journal</w:t>
-      </w:r>
-      <w:r>
-        <w:t xml:space="preserve">,</w:t>
-      </w:r>
-      <w:r>
-        <w:t xml:space="preserve"> </w:t>
-      </w:r>
-      <w:r>
-        <w:rPr>
-          <w:iCs/>
-          <w:i/>
-        </w:rPr>
-        <w:t xml:space="preserve">47</w:t>
+        <w:t xml:space="preserve">Academy of Management Journal, 47</w:t>
       </w:r>
       <w:r>
         <w:t xml:space="preserve">(4), 598–609.</w:t>
@@ -6208,20 +5961,7 @@
           <w:iCs/>
           <w:i/>
         </w:rPr>
-        <w:t xml:space="preserve">Journal of Econometrics</w:t>
-      </w:r>
-      <w:r>
-        <w:t xml:space="preserve">,</w:t>
-      </w:r>
-      <w:r>
-        <w:t xml:space="preserve"> </w:t>
-      </w:r>
-      <w:r>
-        <w:rPr>
-          <w:iCs/>
-          <w:i/>
-        </w:rPr>
-        <w:t xml:space="preserve">29</w:t>
+        <w:t xml:space="preserve">Journal of Econometrics, 29</w:t>
       </w:r>
       <w:r>
         <w:t xml:space="preserve">(3), 305–325.</w:t>
@@ -6253,20 +5993,7 @@
           <w:iCs/>
           <w:i/>
         </w:rPr>
-        <w:t xml:space="preserve">Journal of Management</w:t>
-      </w:r>
-      <w:r>
-        <w:t xml:space="preserve">,</w:t>
-      </w:r>
-      <w:r>
-        <w:t xml:space="preserve"> </w:t>
-      </w:r>
-      <w:r>
-        <w:rPr>
-          <w:iCs/>
-          <w:i/>
-        </w:rPr>
-        <w:t xml:space="preserve">42</w:t>
+        <w:t xml:space="preserve">Journal of Management, 42</w:t>
       </w:r>
       <w:r>
         <w:t xml:space="preserve">(5), 1075–1110.</w:t>
@@ -6298,20 +6025,7 @@
           <w:iCs/>
           <w:i/>
         </w:rPr>
-        <w:t xml:space="preserve">Journal of International Business Studies</w:t>
-      </w:r>
-      <w:r>
-        <w:t xml:space="preserve">,</w:t>
-      </w:r>
-      <w:r>
-        <w:t xml:space="preserve"> </w:t>
-      </w:r>
-      <w:r>
-        <w:rPr>
-          <w:iCs/>
-          <w:i/>
-        </w:rPr>
-        <w:t xml:space="preserve">48</w:t>
+        <w:t xml:space="preserve">Journal of International Business Studies, 48</w:t>
       </w:r>
       <w:r>
         <w:t xml:space="preserve">(5), 535–551.</w:t>
@@ -6343,20 +6057,7 @@
           <w:iCs/>
           <w:i/>
         </w:rPr>
-        <w:t xml:space="preserve">Quality &amp; Quantity</w:t>
-      </w:r>
-      <w:r>
-        <w:t xml:space="preserve">,</w:t>
-      </w:r>
-      <w:r>
-        <w:t xml:space="preserve"> </w:t>
-      </w:r>
-      <w:r>
-        <w:rPr>
-          <w:iCs/>
-          <w:i/>
-        </w:rPr>
-        <w:t xml:space="preserve">41</w:t>
+        <w:t xml:space="preserve">Quality &amp; Quantity, 41</w:t>
       </w:r>
       <w:r>
         <w:t xml:space="preserve">(5), 673–690.</w:t>
@@ -6388,20 +6089,7 @@
           <w:iCs/>
           <w:i/>
         </w:rPr>
-        <w:t xml:space="preserve">Academy of Management Review</w:t>
-      </w:r>
-      <w:r>
-        <w:t xml:space="preserve">,</w:t>
-      </w:r>
-      <w:r>
-        <w:t xml:space="preserve"> </w:t>
-      </w:r>
-      <w:r>
-        <w:rPr>
-          <w:iCs/>
-          <w:i/>
-        </w:rPr>
-        <w:t xml:space="preserve">28</w:t>
+        <w:t xml:space="preserve">Academy of Management Review, 28</w:t>
       </w:r>
       <w:r>
         <w:t xml:space="preserve">(2), 275–296.</w:t>
@@ -6433,20 +6121,7 @@
           <w:iCs/>
           <w:i/>
         </w:rPr>
-        <w:t xml:space="preserve">Journal of International Business Studies</w:t>
-      </w:r>
-      <w:r>
-        <w:t xml:space="preserve">,</w:t>
-      </w:r>
-      <w:r>
-        <w:t xml:space="preserve"> </w:t>
-      </w:r>
-      <w:r>
-        <w:rPr>
-          <w:iCs/>
-          <w:i/>
-        </w:rPr>
-        <w:t xml:space="preserve">39</w:t>
+        <w:t xml:space="preserve">Journal of International Business Studies, 39</w:t>
       </w:r>
       <w:r>
         <w:t xml:space="preserve">(5), 920–936.</w:t>
@@ -6478,20 +6153,7 @@
           <w:iCs/>
           <w:i/>
         </w:rPr>
-        <w:t xml:space="preserve">Journal of International Business Studies</w:t>
-      </w:r>
-      <w:r>
-        <w:t xml:space="preserve">,</w:t>
-      </w:r>
-      <w:r>
-        <w:t xml:space="preserve"> </w:t>
-      </w:r>
-      <w:r>
-        <w:rPr>
-          <w:iCs/>
-          <w:i/>
-        </w:rPr>
-        <w:t xml:space="preserve">35</w:t>
+        <w:t xml:space="preserve">Journal of International Business Studies, 35</w:t>
       </w:r>
       <w:r>
         <w:t xml:space="preserve">(1), 3–18.</w:t>
@@ -6523,20 +6185,7 @@
           <w:iCs/>
           <w:i/>
         </w:rPr>
-        <w:t xml:space="preserve">Journal of Management</w:t>
-      </w:r>
-      <w:r>
-        <w:t xml:space="preserve">,</w:t>
-      </w:r>
-      <w:r>
-        <w:t xml:space="preserve"> </w:t>
-      </w:r>
-      <w:r>
-        <w:rPr>
-          <w:iCs/>
-          <w:i/>
-        </w:rPr>
-        <w:t xml:space="preserve">46</w:t>
+        <w:t xml:space="preserve">Journal of Management, 46</w:t>
       </w:r>
       <w:r>
         <w:t xml:space="preserve">(6), 1244–1256.</w:t>
@@ -6568,20 +6217,7 @@
           <w:iCs/>
           <w:i/>
         </w:rPr>
-        <w:t xml:space="preserve">Global Strategy Journal</w:t>
-      </w:r>
-      <w:r>
-        <w:t xml:space="preserve">,</w:t>
-      </w:r>
-      <w:r>
-        <w:t xml:space="preserve"> </w:t>
-      </w:r>
-      <w:r>
-        <w:rPr>
-          <w:iCs/>
-          <w:i/>
-        </w:rPr>
-        <w:t xml:space="preserve">11</w:t>
+        <w:t xml:space="preserve">Global Strategy Journal, 11</w:t>
       </w:r>
       <w:r>
         <w:t xml:space="preserve">(1), 58–80.</w:t>
@@ -6613,20 +6249,7 @@
           <w:iCs/>
           <w:i/>
         </w:rPr>
-        <w:t xml:space="preserve">Journal of Business Research</w:t>
-      </w:r>
-      <w:r>
-        <w:t xml:space="preserve">,</w:t>
-      </w:r>
-      <w:r>
-        <w:t xml:space="preserve"> </w:t>
-      </w:r>
-      <w:r>
-        <w:rPr>
-          <w:iCs/>
-          <w:i/>
-        </w:rPr>
-        <w:t xml:space="preserve">122</w:t>
+        <w:t xml:space="preserve">Journal of Business Research, 122</w:t>
       </w:r>
       <w:r>
         <w:t xml:space="preserve">, 889–901.</w:t>
@@ -6658,20 +6281,7 @@
           <w:iCs/>
           <w:i/>
         </w:rPr>
-        <w:t xml:space="preserve">Strategic Management Journal</w:t>
-      </w:r>
-      <w:r>
-        <w:t xml:space="preserve">,</w:t>
-      </w:r>
-      <w:r>
-        <w:t xml:space="preserve"> </w:t>
-      </w:r>
-      <w:r>
-        <w:rPr>
-          <w:iCs/>
-          <w:i/>
-        </w:rPr>
-        <w:t xml:space="preserve">40</w:t>
+        <w:t xml:space="preserve">Strategic Management Journal, 40</w:t>
       </w:r>
       <w:r>
         <w:t xml:space="preserve">(3), 432–462.</w:t>

</xml_diff>